<commit_message>
Line up the two "Ngày" rows on CT-02's sign-off table
The SD/SH cell carries a note the candidate's cell does not, and the note
wraps to three lines — pushing SD/SH's "Ngày" row three lines lower than
the candidate's. The candidate's cell now pads with the same number of
blank lines whenever a cell has no note, so both "Ngày" rows land at the
same height regardless of which side has more to say.

Refreshed the blank templates in public/templates to match.

Co-Authored-By: Claude Sonnet 5 <noreply@anthropic.com>
</commit_message>
<xml_diff>
--- a/public/templates/CT02_Dang-ky-chu-ky-mau_mau-trang.docx
+++ b/public/templates/CT02_Dang-ky-chu-ky-mau_mau-trang.docx
@@ -429,6 +429,21 @@
               </w:rPr>
               <w:t xml:space="preserve">ỨNG VIÊN</w:t>
             </w:r>
+          </w:p>
+          <w:p>
+            <w:pPr>
+              <w:spacing w:after="0" w:line="240" w:lineRule="auto"/>
+            </w:pPr>
+          </w:p>
+          <w:p>
+            <w:pPr>
+              <w:spacing w:after="0" w:line="240" w:lineRule="auto"/>
+            </w:pPr>
+          </w:p>
+          <w:p>
+            <w:pPr>
+              <w:spacing w:after="100" w:line="240" w:lineRule="auto"/>
+            </w:pPr>
           </w:p>
           <w:p>
             <w:pPr>

</xml_diff>

<commit_message>
Rename section 2 to "Thông tin đăng ký đại lý", drop CT-02's consent line
Section 2 asks what the candidate is registering for — channel, programme,
position, managers — so it is named for that rather than for recruitment
generally. Both the form and the printed CT-01 read from the same key.

CT-02's opening sentence is gone at the user's request, with the gap above
the specimen table widened to fill the space it left. That sentence was
the only place the candidate agreed to MVI using the specimens to
authenticate transactions; nothing states that purpose now, which Legal
may want placed elsewhere.

Blank templates regenerated.

Co-Authored-By: Claude Opus 5 <noreply@anthropic.com>
</commit_message>
<xml_diff>
--- a/public/templates/CT02_Dang-ky-chu-ky-mau_mau-trang.docx
+++ b/public/templates/CT02_Dang-ky-chu-ky-mau_mau-trang.docx
@@ -103,7 +103,7 @@
             <w:tcMar>
               <w:top w:type="dxa" w:w="0"/>
               <w:left w:type="dxa" w:w="0"/>
-              <w:bottom w:type="dxa" w:w="360"/>
+              <w:bottom w:type="dxa" w:w="460"/>
               <w:right w:type="dxa" w:w="160"/>
             </w:tcMar>
           </w:tcPr>
@@ -128,7 +128,7 @@
             <w:tcMar>
               <w:top w:type="dxa" w:w="0"/>
               <w:left w:type="dxa" w:w="0"/>
-              <w:bottom w:type="dxa" w:w="360"/>
+              <w:bottom w:type="dxa" w:w="460"/>
               <w:right w:type="dxa" w:w="0"/>
             </w:tcMar>
           </w:tcPr>
@@ -149,15 +149,6 @@
         </w:tc>
       </w:tr>
     </w:tbl>
-    <w:p>
-      <w:pPr>
-        <w:keepNext w:val="false"/>
-        <w:spacing w:after="280" w:line="240" w:lineRule="auto"/>
-      </w:pPr>
-      <w:r>
-        <w:t xml:space="preserve">Tôi đồng ý và xác nhận MVI có thể sử dụng các chữ ký mẫu dưới đây để xác thực và xử lý các giao dịch liên quan đến Hợp đồng Đại lý giữa tôi và MVI.</w:t>
-      </w:r>
-    </w:p>
     <w:tbl>
       <w:tblPr>
         <w:tblW w:type="dxa" w:w="9360"/>

</xml_diff>

<commit_message>
Put the signature undertakings back into CT-02
Legal's new draft splits the form into "1. ĐĂNG KÝ CHỮ KÝ MẪU" and
"2. CAM KẾT VỀ CHỮ KÝ": what the specimens are kept for, who answers for
a document signed with them, how a signature is replaced, and the
data-protection tie-back to CT-01. That takes the form to two pages.

The draft's first bullet cross-refers to "Mục 2", which is the bullet's
own section — pointed at Mục 1, where the specimens actually are. The
title is now "PHIẾU CAM KẾT VÀ ĐĂNG KÝ CHỮ KÝ MẪU" so it no longer
repeats the heading directly beneath it.

Co-Authored-By: Claude Opus 5 <noreply@anthropic.com>
</commit_message>
<xml_diff>
--- a/public/templates/CT02_Dang-ky-chu-ky-mau_mau-trang.docx
+++ b/public/templates/CT02_Dang-ky-chu-ky-mau_mau-trang.docx
@@ -41,7 +41,7 @@
           <w:sz w:val="28"/>
           <w:szCs w:val="28"/>
         </w:rPr>
-        <w:t xml:space="preserve">ĐĂNG KÝ CHỮ KÝ MẪU</w:t>
+        <w:t xml:space="preserve">PHIẾU CAM KẾT VÀ ĐĂNG KÝ CHỮ KÝ MẪU</w:t>
       </w:r>
     </w:p>
     <w:p>
@@ -149,6 +149,34 @@
         </w:tc>
       </w:tr>
     </w:tbl>
+    <w:p>
+      <w:pPr>
+        <w:keepNext/>
+        <w:keepLines/>
+        <w:pBdr>
+          <w:bottom w:val="single" w:color="004A7D" w:sz="6" w:space="2"/>
+        </w:pBdr>
+        <w:spacing w:after="60" w:before="260" w:line="240" w:lineRule="auto"/>
+      </w:pPr>
+      <w:r>
+        <w:rPr>
+          <w:b/>
+          <w:bCs/>
+          <w:color w:val="004A7D"/>
+        </w:rPr>
+        <w:t xml:space="preserve">1. ĐĂNG KÝ CHỮ KÝ MẪU</w:t>
+      </w:r>
+    </w:p>
+    <w:p>
+      <w:pPr>
+        <w:keepNext w:val="false"/>
+        <w:spacing w:after="140" w:line="240" w:lineRule="auto"/>
+        <w:jc w:val="both"/>
+      </w:pPr>
+      <w:r>
+        <w:t xml:space="preserve">Tôi đăng ký các chữ ký mẫu dưới đây với Công ty và xác nhận rằng đây là chữ ký do chính tôi thực hiện.</w:t>
+      </w:r>
+    </w:p>
     <w:tbl>
       <w:tblPr>
         <w:tblW w:type="dxa" w:w="9360"/>
@@ -369,15 +397,89 @@
     <w:p>
       <w:pPr>
         <w:keepNext w:val="false"/>
-        <w:spacing w:after="280" w:line="240" w:lineRule="auto"/>
+        <w:spacing w:after="80" w:line="240" w:lineRule="auto"/>
+        <w:jc w:val="both"/>
       </w:pPr>
       <w:r>
         <w:rPr>
           <w:i/>
           <w:iCs/>
         </w:rPr>
-        <w:t xml:space="preserve">(*) Phải trùng khớp với chữ ký trên Phiếu đăng ký đại lý.</w:t>
-      </w:r>
+        <w:t xml:space="preserve">(*) Ba chữ ký mẫu phải thống nhất với nhau và trùng khớp với chữ ký của ứng viên trên các tài liệu khác trong bộ hồ sơ đăng ký ứng tuyển đại lý.</w:t>
+      </w:r>
+    </w:p>
+    <w:p>
+      <w:pPr>
+        <w:keepNext/>
+        <w:keepLines/>
+        <w:pBdr>
+          <w:bottom w:val="single" w:color="004A7D" w:sz="6" w:space="2"/>
+        </w:pBdr>
+        <w:spacing w:after="60" w:before="260" w:line="240" w:lineRule="auto"/>
+      </w:pPr>
+      <w:r>
+        <w:rPr>
+          <w:b/>
+          <w:bCs/>
+          <w:color w:val="004A7D"/>
+        </w:rPr>
+        <w:t xml:space="preserve">2. CAM KẾT VỀ CHỮ KÝ</w:t>
+      </w:r>
+    </w:p>
+    <w:p>
+      <w:pPr>
+        <w:spacing w:after="100" w:line="240" w:lineRule="auto"/>
+        <w:ind w:left="360" w:hanging="200"/>
+        <w:jc w:val="both"/>
+      </w:pPr>
+      <w:r>
+        <w:t xml:space="preserve">•   Tôi cam kết các chữ ký mẫu đăng ký tại Mục 1 là chữ ký do chính tôi thực hiện và được tôi sử dụng thống nhất trong quá trình giao dịch với Công ty.</w:t>
+      </w:r>
+    </w:p>
+    <w:p>
+      <w:pPr>
+        <w:spacing w:after="100" w:line="240" w:lineRule="auto"/>
+        <w:ind w:left="360" w:hanging="200"/>
+        <w:jc w:val="both"/>
+      </w:pPr>
+      <w:r>
+        <w:t xml:space="preserve">•   Tôi đồng ý để Công ty lưu giữ và sử dụng các chữ ký mẫu này nhằm mục đích duy nhất là đối chiếu, xác thực chữ ký của tôi trên các tài liệu, hồ sơ, biểu mẫu và chứng từ mà tôi ký với Công ty. Việc đăng ký chữ ký mẫu không đồng nghĩa với việc chấp thuận nội dung của bất kỳ tài liệu hay giao dịch cụ thể nào.</w:t>
+      </w:r>
+    </w:p>
+    <w:p>
+      <w:pPr>
+        <w:spacing w:after="100" w:line="240" w:lineRule="auto"/>
+        <w:ind w:left="360" w:hanging="200"/>
+        <w:jc w:val="both"/>
+      </w:pPr>
+      <w:r>
+        <w:t xml:space="preserve">•   Tôi chịu trách nhiệm đối với mọi tài liệu, hồ sơ, biểu mẫu và chứng từ được ký bằng chữ ký phù hợp với chữ ký mẫu đã đăng ký tại Phiếu này.</w:t>
+      </w:r>
+    </w:p>
+    <w:p>
+      <w:pPr>
+        <w:spacing w:after="100" w:line="240" w:lineRule="auto"/>
+        <w:ind w:left="360" w:hanging="200"/>
+        <w:jc w:val="both"/>
+      </w:pPr>
+      <w:r>
+        <w:t xml:space="preserve">•   Trường hợp có nhu cầu thay đổi chữ ký mẫu, tôi sẽ đăng ký lại với Công ty theo quy định của Công ty. Chữ ký mẫu mới chỉ có hiệu lực kể từ thời điểm được Công ty ghi nhận và không làm ảnh hưởng đến hiệu lực của các tài liệu đã được ký trước đó.</w:t>
+      </w:r>
+    </w:p>
+    <w:p>
+      <w:pPr>
+        <w:spacing w:after="100" w:line="240" w:lineRule="auto"/>
+        <w:ind w:left="360" w:hanging="200"/>
+        <w:jc w:val="both"/>
+      </w:pPr>
+      <w:r>
+        <w:t xml:space="preserve">•   Tôi hiểu rằng chữ ký là dữ liệu cá nhân cơ bản theo quy định của pháp luật về bảo vệ dữ liệu cá nhân. Việc xử lý dữ liệu cá nhân của tôi liên quan đến Phiếu này được thực hiện theo nội dung thông tin và sự đồng ý xử lý dữ liệu cá nhân mà tôi đã cung cấp tại Phiếu Thông tin tuyển dụng (CT-01).</w:t>
+      </w:r>
+    </w:p>
+    <w:p>
+      <w:pPr>
+        <w:spacing w:after="40" w:line="240" w:lineRule="auto"/>
+      </w:pPr>
     </w:p>
     <w:tbl>
       <w:tblPr>

</xml_diff>